<commit_message>
Update Lab 1 report
Replace the existing document with the completed ATT&CK mapping and SOC investigation table.
</commit_message>
<xml_diff>
--- a/Labs/lab1/lab1.docx
+++ b/Labs/lab1/lab1.docx
@@ -1,11 +1,10 @@
 
 <file path=word/document.xml><?xml version="1.0" encoding="utf-8"?>
-<w:document xmlns:wpc="http://schemas.microsoft.com/office/word/2010/wordprocessingCanvas" xmlns:cx="http://schemas.microsoft.com/office/drawing/2014/chartex" xmlns:cx1="http://schemas.microsoft.com/office/drawing/2015/9/8/chartex" xmlns:cx2="http://schemas.microsoft.com/office/drawing/2015/10/21/chartex" xmlns:cx3="http://schemas.microsoft.com/office/drawing/2016/5/9/chartex" xmlns:cx4="http://schemas.microsoft.com/office/drawing/2016/5/10/chartex" xmlns:cx5="http://schemas.microsoft.com/office/drawing/2016/5/11/chartex" xmlns:cx6="http://schemas.microsoft.com/office/drawing/2016/5/12/chartex" xmlns:cx7="http://schemas.microsoft.com/office/drawing/2016/5/13/chartex" xmlns:cx8="http://schemas.microsoft.com/office/drawing/2016/5/14/chartex" xmlns:mc="http://schemas.openxmlformats.org/markup-compatibility/2006" xmlns:aink="http://schemas.microsoft.com/office/drawing/2016/ink" xmlns:am3d="http://schemas.microsoft.com/office/drawing/2017/model3d" xmlns:o="urn:schemas-microsoft-com:office:office" xmlns:r="http://schemas.openxmlformats.org/officeDocument/2006/relationships" xmlns:m="http://schemas.openxmlformats.org/officeDocument/2006/math" xmlns:v="urn:schemas-microsoft-com:vml" xmlns:wp14="http://schemas.microsoft.com/office/word/2010/wordprocessingDrawing" xmlns:wp="http://schemas.openxmlformats.org/drawingml/2006/wordprocessingDrawing" xmlns:w10="urn:schemas-microsoft-com:office:word" xmlns:w="http://schemas.openxmlformats.org/wordprocessingml/2006/main" xmlns:w14="http://schemas.microsoft.com/office/word/2010/wordml" xmlns:w15="http://schemas.microsoft.com/office/word/2012/wordml" xmlns:w16cid="http://schemas.microsoft.com/office/word/2016/wordml/cid" xmlns:w16se="http://schemas.microsoft.com/office/word/2015/wordml/symex" xmlns:wpg="http://schemas.microsoft.com/office/word/2010/wordprocessingGroup" xmlns:wpi="http://schemas.microsoft.com/office/word/2010/wordprocessingInk" xmlns:wne="http://schemas.microsoft.com/office/word/2006/wordml" xmlns:wps="http://schemas.microsoft.com/office/word/2010/wordprocessingShape" mc:Ignorable="w14 w15 w16se w16cid wp14">
+<w:document xmlns:wpc="http://schemas.microsoft.com/office/word/2010/wordprocessingCanvas" xmlns:cx="http://schemas.microsoft.com/office/drawing/2014/chartex" xmlns:cx1="http://schemas.microsoft.com/office/drawing/2015/9/8/chartex" xmlns:mc="http://schemas.openxmlformats.org/markup-compatibility/2006" xmlns:o="urn:schemas-microsoft-com:office:office" xmlns:r="http://schemas.openxmlformats.org/officeDocument/2006/relationships" xmlns:m="http://schemas.openxmlformats.org/officeDocument/2006/math" xmlns:v="urn:schemas-microsoft-com:vml" xmlns:wp14="http://schemas.microsoft.com/office/word/2010/wordprocessingDrawing" xmlns:wp="http://schemas.openxmlformats.org/drawingml/2006/wordprocessingDrawing" xmlns:w10="urn:schemas-microsoft-com:office:word" xmlns:w="http://schemas.openxmlformats.org/wordprocessingml/2006/main" xmlns:w14="http://schemas.microsoft.com/office/word/2010/wordml" xmlns:w15="http://schemas.microsoft.com/office/word/2012/wordml" xmlns:w16se="http://schemas.microsoft.com/office/word/2015/wordml/symex" xmlns:wpg="http://schemas.microsoft.com/office/word/2010/wordprocessingGroup" xmlns:wpi="http://schemas.microsoft.com/office/word/2010/wordprocessingInk" xmlns:wne="http://schemas.microsoft.com/office/word/2006/wordml" xmlns:wps="http://schemas.microsoft.com/office/word/2010/wordprocessingShape" mc:Ignorable="w14 w15 w16se wp14">
   <w:body>
     <w:p>
       <w:pPr>
         <w:rPr>
-          <w:rFonts w:hint="cs"/>
           <w:rtl/>
         </w:rPr>
       </w:pPr>
@@ -20,16 +19,13 @@
       </w:r>
       <w:proofErr w:type="spellEnd"/>
       <w:r>
-        <w:t xml:space="preserve">, </w:t>
+        <w:t xml:space="preserve">, Lior </w:t>
       </w:r>
       <w:proofErr w:type="spellStart"/>
       <w:r>
-        <w:t>Lior</w:t>
+        <w:t>Mashiach</w:t>
       </w:r>
       <w:proofErr w:type="spellEnd"/>
-      <w:r>
-        <w:t xml:space="preserve"> Mashiach</w:t>
-      </w:r>
     </w:p>
     <w:p/>
     <w:p/>
@@ -408,46 +404,121 @@
           <w:szCs w:val="24"/>
         </w:rPr>
       </w:pPr>
-      <w:bookmarkStart w:id="0" w:name="_GoBack"/>
-      <w:bookmarkEnd w:id="0"/>
     </w:p>
-    <w:p/>
-    <w:p/>
-    <w:p/>
-    <w:p/>
-    <w:p/>
+    <w:p>
+      <w:r>
+        <w:rPr>
+          <w:noProof/>
+        </w:rPr>
+        <w:lastRenderedPageBreak/>
+        <w:drawing>
+          <wp:inline distT="0" distB="0" distL="0" distR="0" wp14:anchorId="28216DBF" wp14:editId="257C027E">
+            <wp:extent cx="5934075" cy="2676525"/>
+            <wp:effectExtent l="0" t="0" r="9525" b="9525"/>
+            <wp:docPr id="1" name="תמונה 1" descr="C:\Users\liorm\AppData\Local\Microsoft\Windows\INetCache\Content.Word\T1595.002 Web Exploitation Attack Flow-2026-10-22-134403.png"/>
+            <wp:cNvGraphicFramePr>
+              <a:graphicFrameLocks xmlns:a="http://schemas.openxmlformats.org/drawingml/2006/main" noChangeAspect="1"/>
+            </wp:cNvGraphicFramePr>
+            <a:graphic xmlns:a="http://schemas.openxmlformats.org/drawingml/2006/main">
+              <a:graphicData uri="http://schemas.openxmlformats.org/drawingml/2006/picture">
+                <pic:pic xmlns:pic="http://schemas.openxmlformats.org/drawingml/2006/picture">
+                  <pic:nvPicPr>
+                    <pic:cNvPr id="0" name="Picture 7" descr="C:\Users\liorm\AppData\Local\Microsoft\Windows\INetCache\Content.Word\T1595.002 Web Exploitation Attack Flow-2026-10-22-134403.png"/>
+                    <pic:cNvPicPr>
+                      <a:picLocks noChangeAspect="1" noChangeArrowheads="1"/>
+                    </pic:cNvPicPr>
+                  </pic:nvPicPr>
+                  <pic:blipFill>
+                    <a:blip r:embed="rId6" cstate="print">
+                      <a:extLst>
+                        <a:ext uri="{28A0092B-C50C-407E-A947-70E740481C1C}">
+                          <a14:useLocalDpi xmlns:a14="http://schemas.microsoft.com/office/drawing/2010/main" val="0"/>
+                        </a:ext>
+                      </a:extLst>
+                    </a:blip>
+                    <a:srcRect/>
+                    <a:stretch>
+                      <a:fillRect/>
+                    </a:stretch>
+                  </pic:blipFill>
+                  <pic:spPr bwMode="auto">
+                    <a:xfrm>
+                      <a:off x="0" y="0"/>
+                      <a:ext cx="5934075" cy="2676525"/>
+                    </a:xfrm>
+                    <a:prstGeom prst="rect">
+                      <a:avLst/>
+                    </a:prstGeom>
+                    <a:noFill/>
+                    <a:ln>
+                      <a:noFill/>
+                    </a:ln>
+                  </pic:spPr>
+                </pic:pic>
+              </a:graphicData>
+            </a:graphic>
+          </wp:inline>
+        </w:drawing>
+      </w:r>
+      <w:r>
+        <w:br/>
+      </w:r>
+      <w:r>
+        <w:br/>
+      </w:r>
+      <w:r>
+        <w:br/>
+      </w:r>
+    </w:p>
     <w:tbl>
       <w:tblPr>
-        <w:tblW w:w="0" w:type="auto"/>
+        <w:tblW w:w="9596" w:type="dxa"/>
         <w:jc w:val="center"/>
-        <w:tblLook w:val="04A0" w:firstRow="1" w:lastRow="0" w:firstColumn="1" w:lastColumn="0" w:noHBand="0" w:noVBand="1"/>
+        <w:tblBorders>
+          <w:top w:val="single" w:sz="6" w:space="0" w:color="C7D0DA"/>
+          <w:left w:val="single" w:sz="6" w:space="0" w:color="C7D0DA"/>
+          <w:bottom w:val="single" w:sz="6" w:space="0" w:color="C7D0DA"/>
+          <w:right w:val="single" w:sz="6" w:space="0" w:color="C7D0DA"/>
+          <w:insideH w:val="single" w:sz="6" w:space="0" w:color="C7D0DA"/>
+          <w:insideV w:val="single" w:sz="6" w:space="0" w:color="C7D0DA"/>
+        </w:tblBorders>
+        <w:tblLayout w:type="fixed"/>
+        <w:tblCellMar>
+          <w:top w:w="55" w:type="dxa"/>
+          <w:left w:w="75" w:type="dxa"/>
+          <w:bottom w:w="55" w:type="dxa"/>
+          <w:right w:w="75" w:type="dxa"/>
+        </w:tblCellMar>
+        <w:tblLook w:val="0620" w:firstRow="1" w:lastRow="0" w:firstColumn="0" w:lastColumn="0" w:noHBand="1" w:noVBand="1"/>
       </w:tblPr>
       <w:tblGrid>
-        <w:gridCol w:w="1660"/>
-        <w:gridCol w:w="1346"/>
-        <w:gridCol w:w="1690"/>
-        <w:gridCol w:w="2315"/>
-        <w:gridCol w:w="2349"/>
+        <w:gridCol w:w="1835"/>
+        <w:gridCol w:w="1285"/>
+        <w:gridCol w:w="1670"/>
+        <w:gridCol w:w="2420"/>
+        <w:gridCol w:w="2386"/>
       </w:tblGrid>
       <w:tr>
         <w:trPr>
+          <w:tblHeader/>
           <w:jc w:val="center"/>
         </w:trPr>
         <w:tc>
           <w:tcPr>
-            <w:tcW w:w="1800" w:type="dxa"/>
-            <w:shd w:val="clear" w:color="auto" w:fill="173B60"/>
-            <w:hideMark/>
-          </w:tcPr>
-          <w:p>
-            <w:pPr>
-              <w:spacing w:line="256" w:lineRule="auto"/>
-            </w:pPr>
-            <w:r>
-              <w:rPr>
+            <w:tcW w:w="1835" w:type="dxa"/>
+            <w:shd w:val="clear" w:color="auto" w:fill="193B5F"/>
+            <w:vAlign w:val="center"/>
+          </w:tcPr>
+          <w:p>
+            <w:pPr>
+              <w:spacing w:after="20" w:line="220" w:lineRule="auto"/>
+            </w:pPr>
+            <w:r>
+              <w:rPr>
+                <w:rFonts w:ascii="Calibri" w:hAnsi="Calibri" w:cs="Calibri"/>
                 <w:b/>
                 <w:color w:val="FFFFFF"/>
-                <w:sz w:val="18"/>
+                <w:sz w:val="17"/>
               </w:rPr>
               <w:t>Observed behavior</w:t>
             </w:r>
@@ -455,19 +526,20 @@
         </w:tc>
         <w:tc>
           <w:tcPr>
-            <w:tcW w:w="1440" w:type="dxa"/>
-            <w:shd w:val="clear" w:color="auto" w:fill="173B60"/>
-            <w:hideMark/>
-          </w:tcPr>
-          <w:p>
-            <w:pPr>
-              <w:spacing w:line="256" w:lineRule="auto"/>
-            </w:pPr>
-            <w:r>
-              <w:rPr>
+            <w:tcW w:w="1285" w:type="dxa"/>
+            <w:shd w:val="clear" w:color="auto" w:fill="193B5F"/>
+            <w:vAlign w:val="center"/>
+          </w:tcPr>
+          <w:p>
+            <w:pPr>
+              <w:spacing w:after="20" w:line="220" w:lineRule="auto"/>
+            </w:pPr>
+            <w:r>
+              <w:rPr>
+                <w:rFonts w:ascii="Calibri" w:hAnsi="Calibri" w:cs="Calibri"/>
                 <w:b/>
                 <w:color w:val="FFFFFF"/>
-                <w:sz w:val="18"/>
+                <w:sz w:val="17"/>
               </w:rPr>
               <w:t>ATT&amp;CK tactic</w:t>
             </w:r>
@@ -475,19 +547,20 @@
         </w:tc>
         <w:tc>
           <w:tcPr>
-            <w:tcW w:w="1800" w:type="dxa"/>
-            <w:shd w:val="clear" w:color="auto" w:fill="173B60"/>
-            <w:hideMark/>
-          </w:tcPr>
-          <w:p>
-            <w:pPr>
-              <w:spacing w:line="256" w:lineRule="auto"/>
-            </w:pPr>
-            <w:r>
-              <w:rPr>
+            <w:tcW w:w="1670" w:type="dxa"/>
+            <w:shd w:val="clear" w:color="auto" w:fill="193B5F"/>
+            <w:vAlign w:val="center"/>
+          </w:tcPr>
+          <w:p>
+            <w:pPr>
+              <w:spacing w:after="20" w:line="220" w:lineRule="auto"/>
+            </w:pPr>
+            <w:r>
+              <w:rPr>
+                <w:rFonts w:ascii="Calibri" w:hAnsi="Calibri" w:cs="Calibri"/>
                 <w:b/>
                 <w:color w:val="FFFFFF"/>
-                <w:sz w:val="18"/>
+                <w:sz w:val="17"/>
               </w:rPr>
               <w:t>Technique / ID</w:t>
             </w:r>
@@ -495,39 +568,50 @@
         </w:tc>
         <w:tc>
           <w:tcPr>
-            <w:tcW w:w="2592" w:type="dxa"/>
-            <w:shd w:val="clear" w:color="auto" w:fill="173B60"/>
-            <w:hideMark/>
-          </w:tcPr>
-          <w:p>
-            <w:pPr>
-              <w:spacing w:line="256" w:lineRule="auto"/>
-            </w:pPr>
-            <w:r>
-              <w:rPr>
+            <w:tcW w:w="2420" w:type="dxa"/>
+            <w:shd w:val="clear" w:color="auto" w:fill="193B5F"/>
+            <w:vAlign w:val="center"/>
+          </w:tcPr>
+          <w:p>
+            <w:pPr>
+              <w:spacing w:after="20" w:line="220" w:lineRule="auto"/>
+            </w:pPr>
+            <w:r>
+              <w:rPr>
+                <w:rFonts w:ascii="Calibri" w:hAnsi="Calibri" w:cs="Calibri"/>
                 <w:b/>
                 <w:color w:val="FFFFFF"/>
-                <w:sz w:val="18"/>
-              </w:rPr>
-              <w:t>Evidence and mapping rationale</w:t>
-            </w:r>
-          </w:p>
-        </w:tc>
-        <w:tc>
-          <w:tcPr>
-            <w:tcW w:w="2592" w:type="dxa"/>
-            <w:shd w:val="clear" w:color="auto" w:fill="173B60"/>
-            <w:hideMark/>
-          </w:tcPr>
-          <w:p>
-            <w:pPr>
-              <w:spacing w:line="256" w:lineRule="auto"/>
-            </w:pPr>
-            <w:r>
-              <w:rPr>
+                <w:sz w:val="17"/>
+              </w:rPr>
+              <w:t>Evidence and mapping</w:t>
+            </w:r>
+            <w:r>
+              <w:rPr>
+                <w:rFonts w:ascii="Calibri" w:hAnsi="Calibri" w:cs="Calibri"/>
                 <w:b/>
                 <w:color w:val="FFFFFF"/>
-                <w:sz w:val="18"/>
+                <w:sz w:val="17"/>
+              </w:rPr>
+              <w:t xml:space="preserve"> rationale</w:t>
+            </w:r>
+          </w:p>
+        </w:tc>
+        <w:tc>
+          <w:tcPr>
+            <w:tcW w:w="2386" w:type="dxa"/>
+            <w:shd w:val="clear" w:color="auto" w:fill="193B5F"/>
+            <w:vAlign w:val="center"/>
+          </w:tcPr>
+          <w:p>
+            <w:pPr>
+              <w:spacing w:after="20" w:line="220" w:lineRule="auto"/>
+            </w:pPr>
+            <w:r>
+              <w:rPr>
+                <w:rFonts w:ascii="Calibri" w:hAnsi="Calibri" w:cs="Calibri"/>
+                <w:b/>
+                <w:color w:val="FFFFFF"/>
+                <w:sz w:val="17"/>
               </w:rPr>
               <w:t>SOC telemetry / investigation</w:t>
             </w:r>
@@ -536,285 +620,1039 @@
       </w:tr>
       <w:tr>
         <w:trPr>
+          <w:cantSplit/>
           <w:jc w:val="center"/>
         </w:trPr>
         <w:tc>
           <w:tcPr>
-            <w:tcW w:w="1800" w:type="dxa"/>
-            <w:vAlign w:val="center"/>
-            <w:hideMark/>
-          </w:tcPr>
-          <w:p>
-            <w:pPr>
-              <w:spacing w:after="20" w:line="256" w:lineRule="auto"/>
-            </w:pPr>
-            <w:r>
-              <w:rPr>
-                <w:sz w:val="17"/>
-              </w:rPr>
-              <w:t>PowerShell runs a script</w:t>
-            </w:r>
-          </w:p>
-        </w:tc>
-        <w:tc>
-          <w:tcPr>
-            <w:tcW w:w="1440" w:type="dxa"/>
-            <w:vAlign w:val="center"/>
-            <w:hideMark/>
-          </w:tcPr>
-          <w:p>
-            <w:pPr>
-              <w:spacing w:after="20" w:line="256" w:lineRule="auto"/>
-            </w:pPr>
-            <w:r>
-              <w:rPr>
-                <w:sz w:val="17"/>
-              </w:rPr>
-              <w:t>Execution</w:t>
-            </w:r>
-          </w:p>
-        </w:tc>
-        <w:tc>
-          <w:tcPr>
-            <w:tcW w:w="1800" w:type="dxa"/>
-            <w:vAlign w:val="center"/>
-            <w:hideMark/>
-          </w:tcPr>
-          <w:p>
-            <w:pPr>
-              <w:spacing w:after="20" w:line="256" w:lineRule="auto"/>
-            </w:pPr>
-            <w:r>
-              <w:rPr>
-                <w:sz w:val="17"/>
-              </w:rPr>
-              <w:t>PowerShell (T1059.001)</w:t>
-            </w:r>
-          </w:p>
-        </w:tc>
-        <w:tc>
-          <w:tcPr>
-            <w:tcW w:w="2592" w:type="dxa"/>
-            <w:vAlign w:val="center"/>
-            <w:hideMark/>
-          </w:tcPr>
-          <w:p>
-            <w:pPr>
-              <w:spacing w:after="20" w:line="256" w:lineRule="auto"/>
-            </w:pPr>
-            <w:r>
-              <w:rPr>
-                <w:sz w:val="17"/>
-              </w:rPr>
-              <w:t>Report explicitly describes PowerShell script execution.</w:t>
-            </w:r>
-          </w:p>
-        </w:tc>
-        <w:tc>
-          <w:tcPr>
-            <w:tcW w:w="2592" w:type="dxa"/>
-            <w:vAlign w:val="center"/>
-            <w:hideMark/>
-          </w:tcPr>
-          <w:p>
-            <w:pPr>
-              <w:spacing w:after="20" w:line="256" w:lineRule="auto"/>
-            </w:pPr>
-            <w:r>
-              <w:rPr>
-                <w:sz w:val="17"/>
-              </w:rPr>
-              <w:t>Process creation and PowerShell logging; examine command line and parent process.</w:t>
+            <w:tcW w:w="1835" w:type="dxa"/>
+            <w:vAlign w:val="center"/>
+          </w:tcPr>
+          <w:p>
+            <w:pPr>
+              <w:spacing w:after="35" w:line="220" w:lineRule="auto"/>
+            </w:pPr>
+            <w:r>
+              <w:rPr>
+                <w:rFonts w:ascii="Calibri" w:hAnsi="Calibri" w:cs="Calibri"/>
+                <w:sz w:val="17"/>
+              </w:rPr>
+              <w:t>5–15 POSTs to /%50SEMHUB/hub with a serialized Java object to verify whether the target is vulnerable.</w:t>
+            </w:r>
+          </w:p>
+        </w:tc>
+        <w:tc>
+          <w:tcPr>
+            <w:tcW w:w="1285" w:type="dxa"/>
+            <w:vAlign w:val="center"/>
+          </w:tcPr>
+          <w:p>
+            <w:pPr>
+              <w:spacing w:after="35" w:line="220" w:lineRule="auto"/>
+            </w:pPr>
+            <w:r>
+              <w:rPr>
+                <w:rFonts w:ascii="Calibri" w:hAnsi="Calibri" w:cs="Calibri"/>
+                <w:sz w:val="17"/>
+              </w:rPr>
+              <w:t>Reconnaissance</w:t>
+            </w:r>
+          </w:p>
+        </w:tc>
+        <w:tc>
+          <w:tcPr>
+            <w:tcW w:w="1670" w:type="dxa"/>
+            <w:vAlign w:val="center"/>
+          </w:tcPr>
+          <w:p>
+            <w:pPr>
+              <w:spacing w:after="35" w:line="220" w:lineRule="auto"/>
+            </w:pPr>
+            <w:r>
+              <w:rPr>
+                <w:rFonts w:ascii="Calibri" w:hAnsi="Calibri" w:cs="Calibri"/>
+                <w:sz w:val="17"/>
+              </w:rPr>
+              <w:t>Active Scanning: Vulnerability Scanning (T1595.002)</w:t>
+            </w:r>
+          </w:p>
+        </w:tc>
+        <w:tc>
+          <w:tcPr>
+            <w:tcW w:w="2420" w:type="dxa"/>
+            <w:vAlign w:val="center"/>
+          </w:tcPr>
+          <w:p>
+            <w:pPr>
+              <w:spacing w:after="35" w:line="220" w:lineRule="auto"/>
+            </w:pPr>
+            <w:r>
+              <w:rPr>
+                <w:rFonts w:ascii="Calibri" w:hAnsi="Calibri" w:cs="Calibri"/>
+                <w:sz w:val="17"/>
+              </w:rPr>
+              <w:t>Mandiant describes this repeated, non-disrup</w:t>
+            </w:r>
+            <w:r>
+              <w:rPr>
+                <w:rFonts w:ascii="Calibri" w:hAnsi="Calibri" w:cs="Calibri"/>
+                <w:sz w:val="17"/>
+              </w:rPr>
+              <w:t>tive request pattern as target verification before exploitation. It checks for a specific exploitable application condition. The report notes that validation may occur without follow-on activity, so the probe alone does not prove compromise.</w:t>
+            </w:r>
+          </w:p>
+        </w:tc>
+        <w:tc>
+          <w:tcPr>
+            <w:tcW w:w="2386" w:type="dxa"/>
+            <w:vAlign w:val="center"/>
+          </w:tcPr>
+          <w:p>
+            <w:pPr>
+              <w:spacing w:after="35" w:line="220" w:lineRule="auto"/>
+            </w:pPr>
+            <w:r>
+              <w:rPr>
+                <w:rFonts w:ascii="Calibri" w:hAnsi="Calibri" w:cs="Calibri"/>
+                <w:b/>
+                <w:sz w:val="17"/>
+              </w:rPr>
+              <w:t xml:space="preserve">Telemetry: </w:t>
+            </w:r>
+            <w:r>
+              <w:rPr>
+                <w:rFonts w:ascii="Calibri" w:hAnsi="Calibri" w:cs="Calibri"/>
+                <w:sz w:val="17"/>
+              </w:rPr>
+              <w:t>PIA/WebLogic, reverse-proxy and WAF access logs.</w:t>
+            </w:r>
+          </w:p>
+          <w:p>
+            <w:pPr>
+              <w:spacing w:after="35" w:line="220" w:lineRule="auto"/>
+            </w:pPr>
+            <w:r>
+              <w:rPr>
+                <w:rFonts w:ascii="Calibri" w:hAnsi="Calibri" w:cs="Calibri"/>
+                <w:b/>
+                <w:sz w:val="17"/>
+              </w:rPr>
+              <w:t xml:space="preserve">Tier 1: </w:t>
+            </w:r>
+            <w:r>
+              <w:rPr>
+                <w:rFonts w:ascii="Calibri" w:hAnsi="Calibri" w:cs="Calibri"/>
+                <w:sz w:val="17"/>
+              </w:rPr>
+              <w:t>Group repeated POSTs by source, host, URI and response; preserve both raw and normalized paths.</w:t>
+            </w:r>
+          </w:p>
+          <w:p>
+            <w:pPr>
+              <w:spacing w:after="35" w:line="220" w:lineRule="auto"/>
+            </w:pPr>
+            <w:r>
+              <w:rPr>
+                <w:rFonts w:ascii="Calibri" w:hAnsi="Calibri" w:cs="Calibri"/>
+                <w:b/>
+                <w:sz w:val="17"/>
+              </w:rPr>
+              <w:t xml:space="preserve">Tier 2: </w:t>
+            </w:r>
+            <w:r>
+              <w:rPr>
+                <w:rFonts w:ascii="Calibri" w:hAnsi="Calibri" w:cs="Calibri"/>
+                <w:sz w:val="17"/>
+              </w:rPr>
+              <w:t>Correlate with later shell processes or JSP writes; determine whether the host was only checked</w:t>
+            </w:r>
+            <w:r>
+              <w:rPr>
+                <w:rFonts w:ascii="Calibri" w:hAnsi="Calibri" w:cs="Calibri"/>
+                <w:sz w:val="17"/>
+              </w:rPr>
+              <w:t xml:space="preserve"> or later exploited.</w:t>
             </w:r>
           </w:p>
         </w:tc>
       </w:tr>
       <w:tr>
         <w:trPr>
+          <w:cantSplit/>
           <w:jc w:val="center"/>
         </w:trPr>
         <w:tc>
           <w:tcPr>
-            <w:tcW w:w="1800" w:type="dxa"/>
-            <w:vAlign w:val="center"/>
-            <w:hideMark/>
-          </w:tcPr>
-          <w:p>
-            <w:pPr>
-              <w:spacing w:after="20" w:line="256" w:lineRule="auto"/>
-            </w:pPr>
-            <w:r>
-              <w:rPr>
-                <w:sz w:val="17"/>
-              </w:rPr>
-              <w:t>Host runs ipconfig /all</w:t>
-            </w:r>
-          </w:p>
-        </w:tc>
-        <w:tc>
-          <w:tcPr>
-            <w:tcW w:w="1440" w:type="dxa"/>
-            <w:vAlign w:val="center"/>
-            <w:hideMark/>
-          </w:tcPr>
-          <w:p>
-            <w:pPr>
-              <w:spacing w:after="20" w:line="256" w:lineRule="auto"/>
-            </w:pPr>
-            <w:r>
-              <w:rPr>
-                <w:sz w:val="17"/>
-              </w:rPr>
-              <w:t>Discovery</w:t>
-            </w:r>
-          </w:p>
-        </w:tc>
-        <w:tc>
-          <w:tcPr>
-            <w:tcW w:w="1800" w:type="dxa"/>
-            <w:vAlign w:val="center"/>
-            <w:hideMark/>
-          </w:tcPr>
-          <w:p>
-            <w:pPr>
-              <w:spacing w:after="20" w:line="256" w:lineRule="auto"/>
-            </w:pPr>
-            <w:r>
-              <w:rPr>
-                <w:sz w:val="17"/>
-              </w:rPr>
-              <w:t>System Network Configuration Discovery (T1016)</w:t>
-            </w:r>
-          </w:p>
-        </w:tc>
-        <w:tc>
-          <w:tcPr>
-            <w:tcW w:w="2592" w:type="dxa"/>
-            <w:vAlign w:val="center"/>
-            <w:hideMark/>
-          </w:tcPr>
-          <w:p>
-            <w:pPr>
-              <w:spacing w:after="20" w:line="256" w:lineRule="auto"/>
-            </w:pPr>
-            <w:r>
-              <w:rPr>
-                <w:sz w:val="17"/>
-              </w:rPr>
-              <w:t>Report shows the command in the attack sequence.</w:t>
-            </w:r>
-          </w:p>
-        </w:tc>
-        <w:tc>
-          <w:tcPr>
-            <w:tcW w:w="2592" w:type="dxa"/>
-            <w:vAlign w:val="center"/>
-            <w:hideMark/>
-          </w:tcPr>
-          <w:p>
-            <w:pPr>
-              <w:spacing w:after="20" w:line="256" w:lineRule="auto"/>
-            </w:pPr>
-            <w:r>
-              <w:rPr>
-                <w:sz w:val="17"/>
-              </w:rPr>
-              <w:t>Process telemetry; correlate with preceding suspicious activity.</w:t>
+            <w:tcW w:w="1835" w:type="dxa"/>
+            <w:vAlign w:val="center"/>
+          </w:tcPr>
+          <w:p>
+            <w:pPr>
+              <w:spacing w:after="35" w:line="220" w:lineRule="auto"/>
+            </w:pPr>
+            <w:r>
+              <w:rPr>
+                <w:rFonts w:ascii="Calibri" w:hAnsi="Calibri" w:cs="Calibri"/>
+                <w:sz w:val="17"/>
+              </w:rPr>
+              <w:t>The request path uses /%50SEMHUB/ instead of the literal /PSEMHUB/ path to reach the vulnerable endpoint.</w:t>
+            </w:r>
+          </w:p>
+        </w:tc>
+        <w:tc>
+          <w:tcPr>
+            <w:tcW w:w="1285" w:type="dxa"/>
+            <w:vAlign w:val="center"/>
+          </w:tcPr>
+          <w:p>
+            <w:pPr>
+              <w:spacing w:after="35" w:line="220" w:lineRule="auto"/>
+            </w:pPr>
+            <w:r>
+              <w:rPr>
+                <w:rFonts w:ascii="Calibri" w:hAnsi="Calibri" w:cs="Calibri"/>
+                <w:sz w:val="17"/>
+              </w:rPr>
+              <w:t>Defense Evasion</w:t>
+            </w:r>
+          </w:p>
+        </w:tc>
+        <w:tc>
+          <w:tcPr>
+            <w:tcW w:w="1670" w:type="dxa"/>
+            <w:vAlign w:val="center"/>
+          </w:tcPr>
+          <w:p>
+            <w:pPr>
+              <w:spacing w:after="35" w:line="220" w:lineRule="auto"/>
+            </w:pPr>
+            <w:r>
+              <w:rPr>
+                <w:rFonts w:ascii="Calibri" w:hAnsi="Calibri" w:cs="Calibri"/>
+                <w:sz w:val="17"/>
+              </w:rPr>
+              <w:t>Obfuscated Files or Information (T1027)</w:t>
+            </w:r>
+          </w:p>
+        </w:tc>
+        <w:tc>
+          <w:tcPr>
+            <w:tcW w:w="2420" w:type="dxa"/>
+            <w:vAlign w:val="center"/>
+          </w:tcPr>
+          <w:p>
+            <w:pPr>
+              <w:spacing w:after="35" w:line="220" w:lineRule="auto"/>
+            </w:pPr>
+            <w:r>
+              <w:rPr>
+                <w:rFonts w:ascii="Calibri" w:hAnsi="Calibri" w:cs="Calibri"/>
+                <w:sz w:val="17"/>
+              </w:rPr>
+              <w:t>The report says percent-encoding P bypassed string-based WAF matching wh</w:t>
+            </w:r>
+            <w:r>
+              <w:rPr>
+                <w:rFonts w:ascii="Calibri" w:hAnsi="Calibri" w:cs="Calibri"/>
+                <w:sz w:val="17"/>
+              </w:rPr>
+              <w:t>ile WebLogic decoded and routed the path. Its ATT&amp;CK summary maps this behavior to T1027. No narrower sub-technique is assigned because the observed encoding is in a URI path, not a command or file.</w:t>
+            </w:r>
+          </w:p>
+        </w:tc>
+        <w:tc>
+          <w:tcPr>
+            <w:tcW w:w="2386" w:type="dxa"/>
+            <w:vAlign w:val="center"/>
+          </w:tcPr>
+          <w:p>
+            <w:pPr>
+              <w:spacing w:after="35" w:line="220" w:lineRule="auto"/>
+            </w:pPr>
+            <w:r>
+              <w:rPr>
+                <w:rFonts w:ascii="Calibri" w:hAnsi="Calibri" w:cs="Calibri"/>
+                <w:b/>
+                <w:sz w:val="17"/>
+              </w:rPr>
+              <w:t xml:space="preserve">Telemetry: </w:t>
+            </w:r>
+            <w:r>
+              <w:rPr>
+                <w:rFonts w:ascii="Calibri" w:hAnsi="Calibri" w:cs="Calibri"/>
+                <w:sz w:val="17"/>
+              </w:rPr>
+              <w:t>WAF/reverse-proxy logs and WebLogic access log</w:t>
+            </w:r>
+            <w:r>
+              <w:rPr>
+                <w:rFonts w:ascii="Calibri" w:hAnsi="Calibri" w:cs="Calibri"/>
+                <w:sz w:val="17"/>
+              </w:rPr>
+              <w:t>s.</w:t>
+            </w:r>
+          </w:p>
+          <w:p>
+            <w:pPr>
+              <w:spacing w:after="35" w:line="220" w:lineRule="auto"/>
+            </w:pPr>
+            <w:r>
+              <w:rPr>
+                <w:rFonts w:ascii="Calibri" w:hAnsi="Calibri" w:cs="Calibri"/>
+                <w:b/>
+                <w:sz w:val="17"/>
+              </w:rPr>
+              <w:t xml:space="preserve">Tier 1: </w:t>
+            </w:r>
+            <w:r>
+              <w:rPr>
+                <w:rFonts w:ascii="Calibri" w:hAnsi="Calibri" w:cs="Calibri"/>
+                <w:sz w:val="17"/>
+              </w:rPr>
+              <w:t>Compare raw and normalized URI, method and response; flag encoded PSEMHUB variants.</w:t>
+            </w:r>
+          </w:p>
+          <w:p>
+            <w:pPr>
+              <w:spacing w:after="35" w:line="220" w:lineRule="auto"/>
+            </w:pPr>
+            <w:r>
+              <w:rPr>
+                <w:rFonts w:ascii="Calibri" w:hAnsi="Calibri" w:cs="Calibri"/>
+                <w:b/>
+                <w:sz w:val="17"/>
+              </w:rPr>
+              <w:t xml:space="preserve">Tier 2: </w:t>
+            </w:r>
+            <w:r>
+              <w:rPr>
+                <w:rFonts w:ascii="Calibri" w:hAnsi="Calibri" w:cs="Calibri"/>
+                <w:sz w:val="17"/>
+              </w:rPr>
+              <w:t>Correlate requests with servlet activity and assess whether path normalization allowed the request past the WAF.</w:t>
             </w:r>
           </w:p>
         </w:tc>
       </w:tr>
       <w:tr>
         <w:trPr>
+          <w:cantSplit/>
           <w:jc w:val="center"/>
         </w:trPr>
         <w:tc>
           <w:tcPr>
-            <w:tcW w:w="1800" w:type="dxa"/>
-            <w:vAlign w:val="center"/>
-            <w:hideMark/>
-          </w:tcPr>
-          <w:p>
-            <w:pPr>
-              <w:spacing w:after="20" w:line="256" w:lineRule="auto"/>
-            </w:pPr>
-            <w:r>
-              <w:rPr>
-                <w:sz w:val="17"/>
-              </w:rPr>
-              <w:t>[Add report behavior]</w:t>
-            </w:r>
-          </w:p>
-        </w:tc>
-        <w:tc>
-          <w:tcPr>
-            <w:tcW w:w="1440" w:type="dxa"/>
-            <w:vAlign w:val="center"/>
-            <w:hideMark/>
-          </w:tcPr>
-          <w:p>
-            <w:pPr>
-              <w:spacing w:after="20" w:line="256" w:lineRule="auto"/>
-            </w:pPr>
-            <w:r>
-              <w:rPr>
-                <w:sz w:val="17"/>
-              </w:rPr>
-              <w:t>[Tactic]</w:t>
-            </w:r>
-          </w:p>
-        </w:tc>
-        <w:tc>
-          <w:tcPr>
-            <w:tcW w:w="1800" w:type="dxa"/>
-            <w:vAlign w:val="center"/>
-            <w:hideMark/>
-          </w:tcPr>
-          <w:p>
-            <w:pPr>
-              <w:spacing w:after="20" w:line="256" w:lineRule="auto"/>
-            </w:pPr>
-            <w:r>
-              <w:rPr>
-                <w:sz w:val="17"/>
-              </w:rPr>
-              <w:t>[Technique / ID]</w:t>
-            </w:r>
-          </w:p>
-        </w:tc>
-        <w:tc>
-          <w:tcPr>
-            <w:tcW w:w="2592" w:type="dxa"/>
-            <w:vAlign w:val="center"/>
-            <w:hideMark/>
-          </w:tcPr>
-          <w:p>
-            <w:pPr>
-              <w:spacing w:after="20" w:line="256" w:lineRule="auto"/>
-            </w:pPr>
-            <w:r>
-              <w:rPr>
-                <w:sz w:val="17"/>
-              </w:rPr>
-              <w:t>[Source passage + reason]</w:t>
-            </w:r>
-          </w:p>
-        </w:tc>
-        <w:tc>
-          <w:tcPr>
-            <w:tcW w:w="2592" w:type="dxa"/>
-            <w:vAlign w:val="center"/>
-            <w:hideMark/>
-          </w:tcPr>
-          <w:p>
-            <w:pPr>
-              <w:spacing w:after="20" w:line="256" w:lineRule="auto"/>
-            </w:pPr>
-            <w:r>
-              <w:rPr>
-                <w:sz w:val="17"/>
-              </w:rPr>
-              <w:t>[Relevant evidence / next step]</w:t>
+            <w:tcW w:w="1835" w:type="dxa"/>
+            <w:vAlign w:val="center"/>
+          </w:tcPr>
+          <w:p>
+            <w:pPr>
+              <w:spacing w:after="35" w:line="220" w:lineRule="auto"/>
+            </w:pPr>
+            <w:r>
+              <w:rPr>
+                <w:rFonts w:ascii="Calibri" w:hAnsi="Calibri" w:cs="Calibri"/>
+                <w:sz w:val="17"/>
+              </w:rPr>
+              <w:lastRenderedPageBreak/>
+              <w:t>An external request exploits CVE-2026-3</w:t>
+            </w:r>
+            <w:r>
+              <w:rPr>
+                <w:rFonts w:ascii="Calibri" w:hAnsi="Calibri" w:cs="Calibri"/>
+                <w:sz w:val="17"/>
+              </w:rPr>
+              <w:t>5273 in PSEMHUB; the WebLogic Java process can spawn cmd.exe or /bin/sh and return command output without writing a file.</w:t>
+            </w:r>
+          </w:p>
+        </w:tc>
+        <w:tc>
+          <w:tcPr>
+            <w:tcW w:w="1285" w:type="dxa"/>
+            <w:vAlign w:val="center"/>
+          </w:tcPr>
+          <w:p>
+            <w:pPr>
+              <w:spacing w:after="35" w:line="220" w:lineRule="auto"/>
+            </w:pPr>
+            <w:r>
+              <w:rPr>
+                <w:rFonts w:ascii="Calibri" w:hAnsi="Calibri" w:cs="Calibri"/>
+                <w:sz w:val="17"/>
+              </w:rPr>
+              <w:t>Initial Access; Execution</w:t>
+            </w:r>
+          </w:p>
+        </w:tc>
+        <w:tc>
+          <w:tcPr>
+            <w:tcW w:w="1670" w:type="dxa"/>
+            <w:vAlign w:val="center"/>
+          </w:tcPr>
+          <w:p>
+            <w:pPr>
+              <w:spacing w:after="35" w:line="220" w:lineRule="auto"/>
+            </w:pPr>
+            <w:r>
+              <w:rPr>
+                <w:rFonts w:ascii="Calibri" w:hAnsi="Calibri" w:cs="Calibri"/>
+                <w:sz w:val="17"/>
+              </w:rPr>
+              <w:t>Exploit Public-Facing Application (T1190)</w:t>
+            </w:r>
+          </w:p>
+          <w:p>
+            <w:pPr>
+              <w:spacing w:after="35" w:line="220" w:lineRule="auto"/>
+            </w:pPr>
+            <w:r>
+              <w:rPr>
+                <w:rFonts w:ascii="Calibri" w:hAnsi="Calibri" w:cs="Calibri"/>
+                <w:sz w:val="17"/>
+              </w:rPr>
+              <w:t>Command and Scripting Interpreter: Windows Command Shell (T1059.00</w:t>
+            </w:r>
+            <w:r>
+              <w:rPr>
+                <w:rFonts w:ascii="Calibri" w:hAnsi="Calibri" w:cs="Calibri"/>
+                <w:sz w:val="17"/>
+              </w:rPr>
+              <w:t>3)</w:t>
+            </w:r>
+          </w:p>
+          <w:p>
+            <w:pPr>
+              <w:spacing w:after="35" w:line="220" w:lineRule="auto"/>
+            </w:pPr>
+            <w:r>
+              <w:rPr>
+                <w:rFonts w:ascii="Calibri" w:hAnsi="Calibri" w:cs="Calibri"/>
+                <w:sz w:val="17"/>
+              </w:rPr>
+              <w:t>Command and Scripting Interpreter: Unix Shell (T1059.004)</w:t>
+            </w:r>
+          </w:p>
+        </w:tc>
+        <w:tc>
+          <w:tcPr>
+            <w:tcW w:w="2420" w:type="dxa"/>
+            <w:vAlign w:val="center"/>
+          </w:tcPr>
+          <w:p>
+            <w:pPr>
+              <w:spacing w:after="35" w:line="220" w:lineRule="auto"/>
+            </w:pPr>
+            <w:r>
+              <w:rPr>
+                <w:rFonts w:ascii="Calibri" w:hAnsi="Calibri" w:cs="Calibri"/>
+                <w:sz w:val="17"/>
+              </w:rPr>
+              <w:t>The report identifies the public-facing PSEMHUB servlet and Java deserialization exploit. It separately describes fileless command execution and names the Windows and Unix shell children of WebLo</w:t>
+            </w:r>
+            <w:r>
+              <w:rPr>
+                <w:rFonts w:ascii="Calibri" w:hAnsi="Calibri" w:cs="Calibri"/>
+                <w:sz w:val="17"/>
+              </w:rPr>
+              <w:t>gic, supporting the platform-specific sub-techniques.</w:t>
+            </w:r>
+          </w:p>
+        </w:tc>
+        <w:tc>
+          <w:tcPr>
+            <w:tcW w:w="2386" w:type="dxa"/>
+            <w:vAlign w:val="center"/>
+          </w:tcPr>
+          <w:p>
+            <w:pPr>
+              <w:spacing w:after="35" w:line="220" w:lineRule="auto"/>
+            </w:pPr>
+            <w:r>
+              <w:rPr>
+                <w:rFonts w:ascii="Calibri" w:hAnsi="Calibri" w:cs="Calibri"/>
+                <w:b/>
+                <w:sz w:val="17"/>
+              </w:rPr>
+              <w:t xml:space="preserve">Telemetry: </w:t>
+            </w:r>
+            <w:r>
+              <w:rPr>
+                <w:rFonts w:ascii="Calibri" w:hAnsi="Calibri" w:cs="Calibri"/>
+                <w:sz w:val="17"/>
+              </w:rPr>
+              <w:t>EDR process-creation events, Sysmon Event ID 1, Linux auditd/eBPF, and WebLogic logs.</w:t>
+            </w:r>
+          </w:p>
+          <w:p>
+            <w:pPr>
+              <w:spacing w:after="35" w:line="220" w:lineRule="auto"/>
+            </w:pPr>
+            <w:r>
+              <w:rPr>
+                <w:rFonts w:ascii="Calibri" w:hAnsi="Calibri" w:cs="Calibri"/>
+                <w:b/>
+                <w:sz w:val="17"/>
+              </w:rPr>
+              <w:t xml:space="preserve">Tier 1: </w:t>
+            </w:r>
+            <w:r>
+              <w:rPr>
+                <w:rFonts w:ascii="Calibri" w:hAnsi="Calibri" w:cs="Calibri"/>
+                <w:sz w:val="17"/>
+              </w:rPr>
+              <w:t>Triage WebLogic/JVM-to-cmd.exe or /bin/sh parent-child chains, command line, user and timestamp.</w:t>
+            </w:r>
+          </w:p>
+          <w:p>
+            <w:pPr>
+              <w:spacing w:after="35" w:line="220" w:lineRule="auto"/>
+            </w:pPr>
+            <w:r>
+              <w:rPr>
+                <w:rFonts w:ascii="Calibri" w:hAnsi="Calibri" w:cs="Calibri"/>
+                <w:b/>
+                <w:sz w:val="17"/>
+              </w:rPr>
+              <w:t xml:space="preserve">Tier 2: </w:t>
+            </w:r>
+            <w:r>
+              <w:rPr>
+                <w:rFonts w:ascii="Calibri" w:hAnsi="Calibri" w:cs="Calibri"/>
+                <w:sz w:val="17"/>
+              </w:rPr>
+              <w:t>Align process starts with POST /hub requests and responses; reconstruct commands, scope affected nodes and distinguish approved administration.</w:t>
+            </w:r>
+          </w:p>
+        </w:tc>
+      </w:tr>
+      <w:tr>
+        <w:trPr>
+          <w:cantSplit/>
+          <w:jc w:val="center"/>
+        </w:trPr>
+        <w:tc>
+          <w:tcPr>
+            <w:tcW w:w="1835" w:type="dxa"/>
+            <w:vAlign w:val="center"/>
+          </w:tcPr>
+          <w:p>
+            <w:pPr>
+              <w:spacing w:after="35" w:line="220" w:lineRule="auto"/>
+            </w:pPr>
+            <w:r>
+              <w:rPr>
+                <w:rFonts w:ascii="Calibri" w:hAnsi="Calibri" w:cs="Calibri"/>
+                <w:sz w:val="17"/>
+              </w:rPr>
+              <w:t>Unexpected x.jsp and u.jsp web shells are written into the PSEMHUB.war directory.</w:t>
+            </w:r>
+          </w:p>
+        </w:tc>
+        <w:tc>
+          <w:tcPr>
+            <w:tcW w:w="1285" w:type="dxa"/>
+            <w:vAlign w:val="center"/>
+          </w:tcPr>
+          <w:p>
+            <w:pPr>
+              <w:spacing w:after="35" w:line="220" w:lineRule="auto"/>
+            </w:pPr>
+            <w:r>
+              <w:rPr>
+                <w:rFonts w:ascii="Calibri" w:hAnsi="Calibri" w:cs="Calibri"/>
+                <w:sz w:val="17"/>
+              </w:rPr>
+              <w:t>Persistence</w:t>
+            </w:r>
+          </w:p>
+        </w:tc>
+        <w:tc>
+          <w:tcPr>
+            <w:tcW w:w="1670" w:type="dxa"/>
+            <w:vAlign w:val="center"/>
+          </w:tcPr>
+          <w:p>
+            <w:pPr>
+              <w:spacing w:after="35" w:line="220" w:lineRule="auto"/>
+            </w:pPr>
+            <w:r>
+              <w:rPr>
+                <w:rFonts w:ascii="Calibri" w:hAnsi="Calibri" w:cs="Calibri"/>
+                <w:sz w:val="17"/>
+              </w:rPr>
+              <w:t>Server So</w:t>
+            </w:r>
+            <w:r>
+              <w:rPr>
+                <w:rFonts w:ascii="Calibri" w:hAnsi="Calibri" w:cs="Calibri"/>
+                <w:sz w:val="17"/>
+              </w:rPr>
+              <w:t>ftware Component: Web Shell (T1505.003)</w:t>
+            </w:r>
+          </w:p>
+        </w:tc>
+        <w:tc>
+          <w:tcPr>
+            <w:tcW w:w="2420" w:type="dxa"/>
+            <w:vAlign w:val="center"/>
+          </w:tcPr>
+          <w:p>
+            <w:pPr>
+              <w:spacing w:after="35" w:line="220" w:lineRule="auto"/>
+            </w:pPr>
+            <w:r>
+              <w:rPr>
+                <w:rFonts w:ascii="Calibri" w:hAnsi="Calibri" w:cs="Calibri"/>
+                <w:sz w:val="17"/>
+              </w:rPr>
+              <w:t>Mandiant names x.jsp and u.jsp as deployed web shells and describes their remote command and file-handling functions. A server-side script placed in an exposed web directory is a direct match; no additional persisten</w:t>
+            </w:r>
+            <w:r>
+              <w:rPr>
+                <w:rFonts w:ascii="Calibri" w:hAnsi="Calibri" w:cs="Calibri"/>
+                <w:sz w:val="17"/>
+              </w:rPr>
+              <w:t>ce sub-technique is needed.</w:t>
+            </w:r>
+          </w:p>
+        </w:tc>
+        <w:tc>
+          <w:tcPr>
+            <w:tcW w:w="2386" w:type="dxa"/>
+            <w:vAlign w:val="center"/>
+          </w:tcPr>
+          <w:p>
+            <w:pPr>
+              <w:spacing w:after="35" w:line="220" w:lineRule="auto"/>
+            </w:pPr>
+            <w:r>
+              <w:rPr>
+                <w:rFonts w:ascii="Calibri" w:hAnsi="Calibri" w:cs="Calibri"/>
+                <w:b/>
+                <w:sz w:val="17"/>
+              </w:rPr>
+              <w:t xml:space="preserve">Telemetry: </w:t>
+            </w:r>
+            <w:r>
+              <w:rPr>
+                <w:rFonts w:ascii="Calibri" w:hAnsi="Calibri" w:cs="Calibri"/>
+                <w:sz w:val="17"/>
+              </w:rPr>
+              <w:t>EDR/file-integrity events and WebLogic access logs.</w:t>
+            </w:r>
+          </w:p>
+          <w:p>
+            <w:pPr>
+              <w:spacing w:after="35" w:line="220" w:lineRule="auto"/>
+            </w:pPr>
+            <w:r>
+              <w:rPr>
+                <w:rFonts w:ascii="Calibri" w:hAnsi="Calibri" w:cs="Calibri"/>
+                <w:b/>
+                <w:sz w:val="17"/>
+              </w:rPr>
+              <w:t xml:space="preserve">Tier 1: </w:t>
+            </w:r>
+            <w:r>
+              <w:rPr>
+                <w:rFonts w:ascii="Calibri" w:hAnsi="Calibri" w:cs="Calibri"/>
+                <w:sz w:val="17"/>
+              </w:rPr>
+              <w:t>Identify new or modified JSP files, timestamps, hashes and requests to them; compare with the shipped baseline.</w:t>
+            </w:r>
+          </w:p>
+          <w:p>
+            <w:pPr>
+              <w:spacing w:after="35" w:line="220" w:lineRule="auto"/>
+            </w:pPr>
+            <w:r>
+              <w:rPr>
+                <w:rFonts w:ascii="Calibri" w:hAnsi="Calibri" w:cs="Calibri"/>
+                <w:b/>
+                <w:sz w:val="17"/>
+              </w:rPr>
+              <w:t xml:space="preserve">Tier 2: </w:t>
+            </w:r>
+            <w:r>
+              <w:rPr>
+                <w:rFonts w:ascii="Calibri" w:hAnsi="Calibri" w:cs="Calibri"/>
+                <w:sz w:val="17"/>
+              </w:rPr>
+              <w:t>Inspect content and writer process/ac</w:t>
+            </w:r>
+            <w:r>
+              <w:rPr>
+                <w:rFonts w:ascii="Calibri" w:hAnsi="Calibri" w:cs="Calibri"/>
+                <w:sz w:val="17"/>
+              </w:rPr>
+              <w:t>count, correlate with exploit traffic, check every load-balanced node and preserve evidence.</w:t>
+            </w:r>
+          </w:p>
+        </w:tc>
+      </w:tr>
+      <w:tr>
+        <w:trPr>
+          <w:cantSplit/>
+          <w:jc w:val="center"/>
+        </w:trPr>
+        <w:tc>
+          <w:tcPr>
+            <w:tcW w:w="1835" w:type="dxa"/>
+            <w:vAlign w:val="center"/>
+          </w:tcPr>
+          <w:p>
+            <w:pPr>
+              <w:spacing w:after="35" w:line="220" w:lineRule="auto"/>
+            </w:pPr>
+            <w:bookmarkStart w:id="0" w:name="_GoBack" w:colFirst="1" w:colLast="1"/>
+            <w:r>
+              <w:rPr>
+                <w:rFonts w:ascii="Calibri" w:hAnsi="Calibri" w:cs="Calibri"/>
+                <w:sz w:val="17"/>
+              </w:rPr>
+              <w:t>Post-exploitation commands include hostname, uname -a, whoami/id and tasklist to learn host, user and running-process information.</w:t>
+            </w:r>
+          </w:p>
+        </w:tc>
+        <w:tc>
+          <w:tcPr>
+            <w:tcW w:w="1285" w:type="dxa"/>
+            <w:vAlign w:val="center"/>
+          </w:tcPr>
+          <w:p>
+            <w:pPr>
+              <w:spacing w:after="35" w:line="220" w:lineRule="auto"/>
+            </w:pPr>
+            <w:r>
+              <w:rPr>
+                <w:rFonts w:ascii="Calibri" w:hAnsi="Calibri" w:cs="Calibri"/>
+                <w:sz w:val="17"/>
+              </w:rPr>
+              <w:t>Discovery</w:t>
+            </w:r>
+          </w:p>
+        </w:tc>
+        <w:tc>
+          <w:tcPr>
+            <w:tcW w:w="1670" w:type="dxa"/>
+            <w:vAlign w:val="center"/>
+          </w:tcPr>
+          <w:p>
+            <w:pPr>
+              <w:spacing w:after="35" w:line="220" w:lineRule="auto"/>
+            </w:pPr>
+            <w:r>
+              <w:rPr>
+                <w:rFonts w:ascii="Calibri" w:hAnsi="Calibri" w:cs="Calibri"/>
+                <w:sz w:val="17"/>
+              </w:rPr>
+              <w:t>System Information Di</w:t>
+            </w:r>
+            <w:r>
+              <w:rPr>
+                <w:rFonts w:ascii="Calibri" w:hAnsi="Calibri" w:cs="Calibri"/>
+                <w:sz w:val="17"/>
+              </w:rPr>
+              <w:t>scovery (T1082)</w:t>
+            </w:r>
+          </w:p>
+          <w:p>
+            <w:pPr>
+              <w:spacing w:after="35" w:line="220" w:lineRule="auto"/>
+            </w:pPr>
+            <w:r>
+              <w:rPr>
+                <w:rFonts w:ascii="Calibri" w:hAnsi="Calibri" w:cs="Calibri"/>
+                <w:sz w:val="17"/>
+              </w:rPr>
+              <w:t>System Owner/User Discovery (T1033)</w:t>
+            </w:r>
+          </w:p>
+          <w:p>
+            <w:pPr>
+              <w:spacing w:after="35" w:line="220" w:lineRule="auto"/>
+            </w:pPr>
+            <w:r>
+              <w:rPr>
+                <w:rFonts w:ascii="Calibri" w:hAnsi="Calibri" w:cs="Calibri"/>
+                <w:sz w:val="17"/>
+              </w:rPr>
+              <w:t>Process Discovery (T1057)</w:t>
+            </w:r>
+          </w:p>
+        </w:tc>
+        <w:tc>
+          <w:tcPr>
+            <w:tcW w:w="2420" w:type="dxa"/>
+            <w:vAlign w:val="center"/>
+          </w:tcPr>
+          <w:p>
+            <w:pPr>
+              <w:spacing w:after="35" w:line="220" w:lineRule="auto"/>
+            </w:pPr>
+            <w:r>
+              <w:rPr>
+                <w:rFonts w:ascii="Calibri" w:hAnsi="Calibri" w:cs="Calibri"/>
+                <w:sz w:val="17"/>
+              </w:rPr>
+              <w:t xml:space="preserve">The article explicitly lists the commands: hostname/uname -a for system details, whoami/id for the active identity, and tasklist to verify running processes. Each ID maps to a </w:t>
+            </w:r>
+            <w:r>
+              <w:rPr>
+                <w:rFonts w:ascii="Calibri" w:hAnsi="Calibri" w:cs="Calibri"/>
+                <w:sz w:val="17"/>
+              </w:rPr>
+              <w:t>reported command category.</w:t>
+            </w:r>
+          </w:p>
+        </w:tc>
+        <w:tc>
+          <w:tcPr>
+            <w:tcW w:w="2386" w:type="dxa"/>
+            <w:vAlign w:val="center"/>
+          </w:tcPr>
+          <w:p>
+            <w:pPr>
+              <w:spacing w:after="35" w:line="220" w:lineRule="auto"/>
+            </w:pPr>
+            <w:r>
+              <w:rPr>
+                <w:rFonts w:ascii="Calibri" w:hAnsi="Calibri" w:cs="Calibri"/>
+                <w:b/>
+                <w:sz w:val="17"/>
+              </w:rPr>
+              <w:t xml:space="preserve">Telemetry: </w:t>
+            </w:r>
+            <w:r>
+              <w:rPr>
+                <w:rFonts w:ascii="Calibri" w:hAnsi="Calibri" w:cs="Calibri"/>
+                <w:sz w:val="17"/>
+              </w:rPr>
+              <w:t>EDR process command lines, Sysmon Event ID 1, Linux auditd and web-shell access logs.</w:t>
+            </w:r>
+          </w:p>
+          <w:p>
+            <w:pPr>
+              <w:spacing w:after="35" w:line="220" w:lineRule="auto"/>
+            </w:pPr>
+            <w:r>
+              <w:rPr>
+                <w:rFonts w:ascii="Calibri" w:hAnsi="Calibri" w:cs="Calibri"/>
+                <w:b/>
+                <w:sz w:val="17"/>
+              </w:rPr>
+              <w:t xml:space="preserve">Tier 1: </w:t>
+            </w:r>
+            <w:r>
+              <w:rPr>
+                <w:rFonts w:ascii="Calibri" w:hAnsi="Calibri" w:cs="Calibri"/>
+                <w:sz w:val="17"/>
+              </w:rPr>
+              <w:t>Flag enumeration commands launched by WebLogic/web-shell processes; record account, host and time.</w:t>
+            </w:r>
+          </w:p>
+          <w:p>
+            <w:pPr>
+              <w:spacing w:after="35" w:line="220" w:lineRule="auto"/>
+            </w:pPr>
+            <w:r>
+              <w:rPr>
+                <w:rFonts w:ascii="Calibri" w:hAnsi="Calibri" w:cs="Calibri"/>
+                <w:b/>
+                <w:sz w:val="17"/>
+              </w:rPr>
+              <w:t xml:space="preserve">Tier 2: </w:t>
+            </w:r>
+            <w:r>
+              <w:rPr>
+                <w:rFonts w:ascii="Calibri" w:hAnsi="Calibri" w:cs="Calibri"/>
+                <w:sz w:val="17"/>
+              </w:rPr>
+              <w:t>Correlate with fi</w:t>
+            </w:r>
+            <w:r>
+              <w:rPr>
+                <w:rFonts w:ascii="Calibri" w:hAnsi="Calibri" w:cs="Calibri"/>
+                <w:sz w:val="17"/>
+              </w:rPr>
+              <w:t>le writes and outbound activity, review root/SYSTEM context and compare with expected admin baselines.</w:t>
+            </w:r>
+          </w:p>
+        </w:tc>
+      </w:tr>
+      <w:bookmarkEnd w:id="0"/>
+      <w:tr>
+        <w:trPr>
+          <w:cantSplit/>
+          <w:jc w:val="center"/>
+        </w:trPr>
+        <w:tc>
+          <w:tcPr>
+            <w:tcW w:w="1835" w:type="dxa"/>
+            <w:vAlign w:val="center"/>
+          </w:tcPr>
+          <w:p>
+            <w:pPr>
+              <w:spacing w:after="35" w:line="220" w:lineRule="auto"/>
+            </w:pPr>
+            <w:r>
+              <w:rPr>
+                <w:rFonts w:ascii="Calibri" w:hAnsi="Calibri" w:cs="Calibri"/>
+                <w:sz w:val="17"/>
+              </w:rPr>
+              <w:t>Neo-ReGeorg provides SOCKS5 tunneling over HTTP/S through the PeopleSoft host; MeshAgent is deployed for interactive remote management.</w:t>
+            </w:r>
+          </w:p>
+        </w:tc>
+        <w:tc>
+          <w:tcPr>
+            <w:tcW w:w="1285" w:type="dxa"/>
+            <w:vAlign w:val="center"/>
+          </w:tcPr>
+          <w:p>
+            <w:pPr>
+              <w:spacing w:after="35" w:line="220" w:lineRule="auto"/>
+            </w:pPr>
+            <w:r>
+              <w:rPr>
+                <w:rFonts w:ascii="Calibri" w:hAnsi="Calibri" w:cs="Calibri"/>
+                <w:sz w:val="17"/>
+              </w:rPr>
+              <w:t>Command and Cont</w:t>
+            </w:r>
+            <w:r>
+              <w:rPr>
+                <w:rFonts w:ascii="Calibri" w:hAnsi="Calibri" w:cs="Calibri"/>
+                <w:sz w:val="17"/>
+              </w:rPr>
+              <w:t>rol</w:t>
+            </w:r>
+          </w:p>
+        </w:tc>
+        <w:tc>
+          <w:tcPr>
+            <w:tcW w:w="1670" w:type="dxa"/>
+            <w:vAlign w:val="center"/>
+          </w:tcPr>
+          <w:p>
+            <w:pPr>
+              <w:spacing w:after="35" w:line="220" w:lineRule="auto"/>
+            </w:pPr>
+            <w:r>
+              <w:rPr>
+                <w:rFonts w:ascii="Calibri" w:hAnsi="Calibri" w:cs="Calibri"/>
+                <w:sz w:val="17"/>
+              </w:rPr>
+              <w:t>Proxy: Internal Proxy (T1090.001)</w:t>
+            </w:r>
+          </w:p>
+          <w:p>
+            <w:pPr>
+              <w:spacing w:after="35" w:line="220" w:lineRule="auto"/>
+            </w:pPr>
+            <w:r>
+              <w:rPr>
+                <w:rFonts w:ascii="Calibri" w:hAnsi="Calibri" w:cs="Calibri"/>
+                <w:sz w:val="17"/>
+              </w:rPr>
+              <w:t>Remote Access Tools (T1219)</w:t>
+            </w:r>
+          </w:p>
+        </w:tc>
+        <w:tc>
+          <w:tcPr>
+            <w:tcW w:w="2420" w:type="dxa"/>
+            <w:vAlign w:val="center"/>
+          </w:tcPr>
+          <w:p>
+            <w:pPr>
+              <w:spacing w:after="35" w:line="220" w:lineRule="auto"/>
+            </w:pPr>
+            <w:r>
+              <w:rPr>
+                <w:rFonts w:ascii="Calibri" w:hAnsi="Calibri" w:cs="Calibri"/>
+                <w:sz w:val="17"/>
+              </w:rPr>
+              <w:t xml:space="preserve">The report says Neo-ReGeorg routes SOCKS5 traffic through HTTP/S and the compromised web tier for internal discovery/lateral movement, supporting Internal Proxy. It identifies MeshAgent as </w:t>
+            </w:r>
+            <w:r>
+              <w:rPr>
+                <w:rFonts w:ascii="Calibri" w:hAnsi="Calibri" w:cs="Calibri"/>
+                <w:sz w:val="17"/>
+              </w:rPr>
+              <w:t>RMM used to maintain interactive access; the broader T1219 mapping is used without a narrower sub-technique.</w:t>
+            </w:r>
+          </w:p>
+        </w:tc>
+        <w:tc>
+          <w:tcPr>
+            <w:tcW w:w="2386" w:type="dxa"/>
+            <w:vAlign w:val="center"/>
+          </w:tcPr>
+          <w:p>
+            <w:pPr>
+              <w:spacing w:after="35" w:line="220" w:lineRule="auto"/>
+            </w:pPr>
+            <w:r>
+              <w:rPr>
+                <w:rFonts w:ascii="Calibri" w:hAnsi="Calibri" w:cs="Calibri"/>
+                <w:b/>
+                <w:sz w:val="17"/>
+              </w:rPr>
+              <w:t xml:space="preserve">Telemetry: </w:t>
+            </w:r>
+            <w:r>
+              <w:rPr>
+                <w:rFonts w:ascii="Calibri" w:hAnsi="Calibri" w:cs="Calibri"/>
+                <w:sz w:val="17"/>
+              </w:rPr>
+              <w:t>Proxy/DNS/firewall/NetFlow and EDR file, process and network events.</w:t>
+            </w:r>
+          </w:p>
+          <w:p>
+            <w:pPr>
+              <w:spacing w:after="35" w:line="220" w:lineRule="auto"/>
+            </w:pPr>
+            <w:r>
+              <w:rPr>
+                <w:rFonts w:ascii="Calibri" w:hAnsi="Calibri" w:cs="Calibri"/>
+                <w:b/>
+                <w:sz w:val="17"/>
+              </w:rPr>
+              <w:t xml:space="preserve">Tier 1: </w:t>
+            </w:r>
+            <w:r>
+              <w:rPr>
+                <w:rFonts w:ascii="Calibri" w:hAnsi="Calibri" w:cs="Calibri"/>
+                <w:sz w:val="17"/>
+              </w:rPr>
+              <w:t>Check for tunnel JSPs, MeshAgent files/processes and outbou</w:t>
+            </w:r>
+            <w:r>
+              <w:rPr>
+                <w:rFonts w:ascii="Calibri" w:hAnsi="Calibri" w:cs="Calibri"/>
+                <w:sz w:val="17"/>
+              </w:rPr>
+              <w:t>nd connections to report indicators; record parent process and destinations.</w:t>
+            </w:r>
+          </w:p>
+          <w:p>
+            <w:pPr>
+              <w:spacing w:after="35" w:line="220" w:lineRule="auto"/>
+            </w:pPr>
+            <w:r>
+              <w:rPr>
+                <w:rFonts w:ascii="Calibri" w:hAnsi="Calibri" w:cs="Calibri"/>
+                <w:b/>
+                <w:sz w:val="17"/>
+              </w:rPr>
+              <w:t xml:space="preserve">Tier 2: </w:t>
+            </w:r>
+            <w:r>
+              <w:rPr>
+                <w:rFonts w:ascii="Calibri" w:hAnsi="Calibri" w:cs="Calibri"/>
+                <w:sz w:val="17"/>
+              </w:rPr>
+              <w:t>Map proxied internal destinations and sessions; investigate MeshCentral/WebSocket traffic and verify whether the RMM use was authorized.</w:t>
             </w:r>
           </w:p>
         </w:tc>
@@ -832,7 +1670,7 @@
 </file>
 
 <file path=word/numbering.xml><?xml version="1.0" encoding="utf-8"?>
-<w:numbering xmlns:wpc="http://schemas.microsoft.com/office/word/2010/wordprocessingCanvas" xmlns:cx="http://schemas.microsoft.com/office/drawing/2014/chartex" xmlns:cx1="http://schemas.microsoft.com/office/drawing/2015/9/8/chartex" xmlns:cx2="http://schemas.microsoft.com/office/drawing/2015/10/21/chartex" xmlns:cx3="http://schemas.microsoft.com/office/drawing/2016/5/9/chartex" xmlns:cx4="http://schemas.microsoft.com/office/drawing/2016/5/10/chartex" xmlns:cx5="http://schemas.microsoft.com/office/drawing/2016/5/11/chartex" xmlns:cx6="http://schemas.microsoft.com/office/drawing/2016/5/12/chartex" xmlns:cx7="http://schemas.microsoft.com/office/drawing/2016/5/13/chartex" xmlns:cx8="http://schemas.microsoft.com/office/drawing/2016/5/14/chartex" xmlns:mc="http://schemas.openxmlformats.org/markup-compatibility/2006" xmlns:aink="http://schemas.microsoft.com/office/drawing/2016/ink" xmlns:am3d="http://schemas.microsoft.com/office/drawing/2017/model3d" xmlns:o="urn:schemas-microsoft-com:office:office" xmlns:r="http://schemas.openxmlformats.org/officeDocument/2006/relationships" xmlns:m="http://schemas.openxmlformats.org/officeDocument/2006/math" xmlns:v="urn:schemas-microsoft-com:vml" xmlns:wp14="http://schemas.microsoft.com/office/word/2010/wordprocessingDrawing" xmlns:wp="http://schemas.openxmlformats.org/drawingml/2006/wordprocessingDrawing" xmlns:w10="urn:schemas-microsoft-com:office:word" xmlns:w="http://schemas.openxmlformats.org/wordprocessingml/2006/main" xmlns:w14="http://schemas.microsoft.com/office/word/2010/wordml" xmlns:w15="http://schemas.microsoft.com/office/word/2012/wordml" xmlns:w16cid="http://schemas.microsoft.com/office/word/2016/wordml/cid" xmlns:w16se="http://schemas.microsoft.com/office/word/2015/wordml/symex" xmlns:wpg="http://schemas.microsoft.com/office/word/2010/wordprocessingGroup" xmlns:wpi="http://schemas.microsoft.com/office/word/2010/wordprocessingInk" xmlns:wne="http://schemas.microsoft.com/office/word/2006/wordml" xmlns:wps="http://schemas.microsoft.com/office/word/2010/wordprocessingShape" mc:Ignorable="w14 w15 w16se w16cid wp14">
+<w:numbering xmlns:wpc="http://schemas.microsoft.com/office/word/2010/wordprocessingCanvas" xmlns:cx="http://schemas.microsoft.com/office/drawing/2014/chartex" xmlns:cx1="http://schemas.microsoft.com/office/drawing/2015/9/8/chartex" xmlns:mc="http://schemas.openxmlformats.org/markup-compatibility/2006" xmlns:o="urn:schemas-microsoft-com:office:office" xmlns:r="http://schemas.openxmlformats.org/officeDocument/2006/relationships" xmlns:m="http://schemas.openxmlformats.org/officeDocument/2006/math" xmlns:v="urn:schemas-microsoft-com:vml" xmlns:wp14="http://schemas.microsoft.com/office/word/2010/wordprocessingDrawing" xmlns:wp="http://schemas.openxmlformats.org/drawingml/2006/wordprocessingDrawing" xmlns:w10="urn:schemas-microsoft-com:office:word" xmlns:w="http://schemas.openxmlformats.org/wordprocessingml/2006/main" xmlns:w14="http://schemas.microsoft.com/office/word/2010/wordml" xmlns:w15="http://schemas.microsoft.com/office/word/2012/wordml" xmlns:w16se="http://schemas.microsoft.com/office/word/2015/wordml/symex" xmlns:wpg="http://schemas.microsoft.com/office/word/2010/wordprocessingGroup" xmlns:wpi="http://schemas.microsoft.com/office/word/2010/wordprocessingInk" xmlns:wne="http://schemas.microsoft.com/office/word/2006/wordml" xmlns:wps="http://schemas.microsoft.com/office/word/2010/wordprocessingShape" mc:Ignorable="w14 w15 w16se wp14">
   <w:abstractNum w:abstractNumId="0" w15:restartNumberingAfterBreak="0">
     <w:nsid w:val="06D306A1"/>
     <w:multiLevelType w:val="multilevel"/>
@@ -1105,7 +1943,7 @@
 </file>
 
 <file path=word/styles.xml><?xml version="1.0" encoding="utf-8"?>
-<w:styles xmlns:mc="http://schemas.openxmlformats.org/markup-compatibility/2006" xmlns:r="http://schemas.openxmlformats.org/officeDocument/2006/relationships" xmlns:w="http://schemas.openxmlformats.org/wordprocessingml/2006/main" xmlns:w14="http://schemas.microsoft.com/office/word/2010/wordml" xmlns:w15="http://schemas.microsoft.com/office/word/2012/wordml" xmlns:w16cid="http://schemas.microsoft.com/office/word/2016/wordml/cid" xmlns:w16se="http://schemas.microsoft.com/office/word/2015/wordml/symex" mc:Ignorable="w14 w15 w16se w16cid">
+<w:styles xmlns:mc="http://schemas.openxmlformats.org/markup-compatibility/2006" xmlns:r="http://schemas.openxmlformats.org/officeDocument/2006/relationships" xmlns:w="http://schemas.openxmlformats.org/wordprocessingml/2006/main" xmlns:w14="http://schemas.microsoft.com/office/word/2010/wordml" xmlns:w15="http://schemas.microsoft.com/office/word/2012/wordml" xmlns:w16se="http://schemas.microsoft.com/office/word/2015/wordml/symex" mc:Ignorable="w14 w15 w16se">
   <w:docDefaults>
     <w:rPrDefault>
       <w:rPr>
@@ -1121,7 +1959,7 @@
       </w:pPr>
     </w:pPrDefault>
   </w:docDefaults>
-  <w:latentStyles w:defLockedState="0" w:defUIPriority="99" w:defSemiHidden="0" w:defUnhideWhenUsed="0" w:defQFormat="0" w:count="375">
+  <w:latentStyles w:defLockedState="0" w:defUIPriority="99" w:defSemiHidden="0" w:defUnhideWhenUsed="0" w:defQFormat="0" w:count="371">
     <w:lsdException w:name="Normal" w:uiPriority="0" w:qFormat="1"/>
     <w:lsdException w:name="heading 1" w:uiPriority="9" w:qFormat="1"/>
     <w:lsdException w:name="heading 2" w:semiHidden="1" w:uiPriority="9" w:unhideWhenUsed="1" w:qFormat="1"/>
@@ -1493,19 +2331,16 @@
     <w:lsdException w:name="List Table 5 Dark Accent 6" w:uiPriority="50"/>
     <w:lsdException w:name="List Table 6 Colorful Accent 6" w:uiPriority="51"/>
     <w:lsdException w:name="List Table 7 Colorful Accent 6" w:uiPriority="52"/>
-    <w:lsdException w:name="Mention" w:semiHidden="1" w:unhideWhenUsed="1"/>
-    <w:lsdException w:name="Smart Hyperlink" w:semiHidden="1" w:unhideWhenUsed="1"/>
-    <w:lsdException w:name="Hashtag" w:semiHidden="1" w:unhideWhenUsed="1"/>
-    <w:lsdException w:name="Unresolved Mention" w:semiHidden="1" w:unhideWhenUsed="1"/>
   </w:latentStyles>
-  <w:style w:type="paragraph" w:default="1" w:styleId="Normal">
+  <w:style w:type="paragraph" w:default="1" w:styleId="a">
     <w:name w:val="Normal"/>
     <w:qFormat/>
+    <w:rsid w:val="000205F1"/>
   </w:style>
-  <w:style w:type="paragraph" w:styleId="Heading5">
+  <w:style w:type="paragraph" w:styleId="5">
     <w:name w:val="heading 5"/>
-    <w:basedOn w:val="Normal"/>
-    <w:link w:val="Heading5Char"/>
+    <w:basedOn w:val="a"/>
+    <w:link w:val="50"/>
     <w:uiPriority w:val="9"/>
     <w:qFormat/>
     <w:rsid w:val="008844A1"/>
@@ -1521,13 +2356,13 @@
       <w:szCs w:val="20"/>
     </w:rPr>
   </w:style>
-  <w:style w:type="character" w:default="1" w:styleId="DefaultParagraphFont">
+  <w:style w:type="character" w:default="1" w:styleId="a0">
     <w:name w:val="Default Paragraph Font"/>
     <w:uiPriority w:val="1"/>
     <w:semiHidden/>
     <w:unhideWhenUsed/>
   </w:style>
-  <w:style w:type="table" w:default="1" w:styleId="TableNormal">
+  <w:style w:type="table" w:default="1" w:styleId="a1">
     <w:name w:val="Normal Table"/>
     <w:uiPriority w:val="99"/>
     <w:semiHidden/>
@@ -1542,16 +2377,16 @@
       </w:tblCellMar>
     </w:tblPr>
   </w:style>
-  <w:style w:type="numbering" w:default="1" w:styleId="NoList">
+  <w:style w:type="numbering" w:default="1" w:styleId="a2">
     <w:name w:val="No List"/>
     <w:uiPriority w:val="99"/>
     <w:semiHidden/>
     <w:unhideWhenUsed/>
   </w:style>
-  <w:style w:type="character" w:customStyle="1" w:styleId="Heading5Char">
-    <w:name w:val="Heading 5 Char"/>
-    <w:basedOn w:val="DefaultParagraphFont"/>
-    <w:link w:val="Heading5"/>
+  <w:style w:type="character" w:customStyle="1" w:styleId="50">
+    <w:name w:val="כותרת 5 תו"/>
+    <w:basedOn w:val="a0"/>
+    <w:link w:val="5"/>
     <w:uiPriority w:val="9"/>
     <w:rsid w:val="008844A1"/>
     <w:rPr>
@@ -1564,7 +2399,7 @@
   </w:style>
   <w:style w:type="paragraph" w:customStyle="1" w:styleId="hphpgf">
     <w:name w:val="hphpgf"/>
-    <w:basedOn w:val="Normal"/>
+    <w:basedOn w:val="a"/>
     <w:rsid w:val="008844A1"/>
     <w:pPr>
       <w:spacing w:before="100" w:beforeAutospacing="1" w:after="100" w:afterAutospacing="1" w:line="240" w:lineRule="auto"/>
@@ -1577,7 +2412,7 @@
   </w:style>
   <w:style w:type="character" w:styleId="Hyperlink">
     <w:name w:val="Hyperlink"/>
-    <w:basedOn w:val="DefaultParagraphFont"/>
+    <w:basedOn w:val="a0"/>
     <w:uiPriority w:val="99"/>
     <w:unhideWhenUsed/>
     <w:rsid w:val="008844A1"/>
@@ -1586,9 +2421,9 @@
       <w:u w:val="single"/>
     </w:rPr>
   </w:style>
-  <w:style w:type="character" w:styleId="UnresolvedMention">
+  <w:style w:type="character" w:customStyle="1" w:styleId="UnresolvedMention">
     <w:name w:val="Unresolved Mention"/>
-    <w:basedOn w:val="DefaultParagraphFont"/>
+    <w:basedOn w:val="a0"/>
     <w:uiPriority w:val="99"/>
     <w:semiHidden/>
     <w:unhideWhenUsed/>
@@ -1600,9 +2435,8 @@
   </w:style>
   <w:style w:type="paragraph" w:styleId="NormalWeb">
     <w:name w:val="Normal (Web)"/>
-    <w:basedOn w:val="Normal"/>
+    <w:basedOn w:val="a"/>
     <w:uiPriority w:val="99"/>
-    <w:semiHidden/>
     <w:unhideWhenUsed/>
     <w:rsid w:val="008844A1"/>
     <w:pPr>
@@ -1616,7 +2450,7 @@
   </w:style>
   <w:style w:type="character" w:styleId="HTMLCode">
     <w:name w:val="HTML Code"/>
-    <w:basedOn w:val="DefaultParagraphFont"/>
+    <w:basedOn w:val="a0"/>
     <w:uiPriority w:val="99"/>
     <w:semiHidden/>
     <w:unhideWhenUsed/>
@@ -1625,6 +2459,17 @@
       <w:rFonts w:ascii="Courier New" w:eastAsia="Times New Roman" w:hAnsi="Courier New" w:cs="Courier New"/>
       <w:sz w:val="20"/>
       <w:szCs w:val="20"/>
+    </w:rPr>
+  </w:style>
+  <w:style w:type="character" w:styleId="a3">
+    <w:name w:val="Strong"/>
+    <w:basedOn w:val="a0"/>
+    <w:uiPriority w:val="22"/>
+    <w:qFormat/>
+    <w:rsid w:val="000205F1"/>
+    <w:rPr>
+      <w:b/>
+      <w:bCs/>
     </w:rPr>
   </w:style>
 </w:styles>

</xml_diff>